<commit_message>
:sparkles: feat: Ajustes para funcionamento de qualificação e substituição do template.docx
</commit_message>
<xml_diff>
--- a/contract_template.docx
+++ b/contract_template.docx
@@ -87,23 +87,7 @@
           <w:szCs w:val="24"/>
         </w:rPr>
         <w:tab/>
-        <w:t xml:space="preserve">Este contrato formaliza a prestação de serviços e venda de produtos da empresa </w:t>
-      </w:r>
-      <w:r>
-        <w:rPr>
-          <w:rFonts w:cs="Times New Roman" w:ascii="Times New Roman" w:hAnsi="Times New Roman"/>
-          <w:sz w:val="24"/>
-          <w:szCs w:val="24"/>
-        </w:rPr>
-        <w:t>{{enterprise}}</w:t>
-      </w:r>
-      <w:r>
-        <w:rPr>
-          <w:rFonts w:cs="Times New Roman" w:ascii="Times New Roman" w:hAnsi="Times New Roman"/>
-          <w:sz w:val="24"/>
-          <w:szCs w:val="24"/>
-        </w:rPr>
-        <w:t xml:space="preserve"> com {{signer_name}}, portador(a) do CPF {{signer_document}}, seguindo as seguintes cláusulas:</w:t>
+        <w:t>Este contrato formaliza a prestação de serviços e venda de produtos da empresa {{enterprise}} com {{signer_name}}, portador(a) do CPF {{signer_document}}, seguindo as seguintes cláusulas:</w:t>
       </w:r>
     </w:p>
     <w:p>
@@ -386,31 +370,7 @@
           <w:rFonts w:ascii="Times New Roman" w:hAnsi="Times New Roman"/>
         </w:rPr>
         <w:tab/>
-        <w:t>São Paulo, {{created_da</w:t>
-      </w:r>
-      <w:r>
-        <w:rPr>
-          <w:rFonts w:ascii="Times New Roman" w:hAnsi="Times New Roman"/>
-        </w:rPr>
-        <w:t>y</w:t>
-      </w:r>
-      <w:r>
-        <w:rPr>
-          <w:rFonts w:ascii="Times New Roman" w:hAnsi="Times New Roman"/>
-        </w:rPr>
-        <w:t xml:space="preserve">_contract}} </w:t>
-      </w:r>
-      <w:r>
-        <w:rPr>
-          <w:rFonts w:ascii="Times New Roman" w:hAnsi="Times New Roman"/>
-        </w:rPr>
-        <w:t>de {{created_month_contract}} de {{created_year_contract}}</w:t>
-      </w:r>
-      <w:r>
-        <w:rPr>
-          <w:rFonts w:ascii="Times New Roman" w:hAnsi="Times New Roman"/>
-        </w:rPr>
-        <w:t>.</w:t>
+        <w:t>São Paulo, {{created_day_contract}} de {{created_month_contract}} de {{created_year_contract}}.</w:t>
       </w:r>
     </w:p>
     <w:p>
@@ -493,14 +453,16 @@
         <w:spacing w:lineRule="auto" w:line="259" w:before="0" w:after="160"/>
         <w:ind w:hanging="0" w:left="0" w:right="0"/>
         <w:contextualSpacing/>
-        <w:rPr>
-          <w:rFonts w:ascii="Times New Roman" w:hAnsi="Times New Roman"/>
-        </w:rPr>
-      </w:pPr>
-      <w:r>
-        <w:rPr>
-          <w:rFonts w:ascii="Times New Roman" w:hAnsi="Times New Roman"/>
-        </w:rPr>
+        <w:jc w:val="center"/>
+        <w:rPr>
+          <w:rFonts w:ascii="Times New Roman" w:hAnsi="Times New Roman"/>
+        </w:rPr>
+      </w:pPr>
+      <w:r>
+        <w:rPr>
+          <w:rFonts w:ascii="Times New Roman" w:hAnsi="Times New Roman"/>
+        </w:rPr>
+        <w:t>{{~position_sign_signer}}</w:t>
       </w:r>
     </w:p>
     <w:p>

</xml_diff>

<commit_message>
:sparkles: feat: Inclusão da chamada para definir rubrica na Clicksign e substituição do template.docx
</commit_message>
<xml_diff>
--- a/contract_template.docx
+++ b/contract_template.docx
@@ -87,7 +87,71 @@
           <w:szCs w:val="24"/>
         </w:rPr>
         <w:tab/>
-        <w:t>Este contrato formaliza a prestação de serviços e venda de produtos da empresa {{enterprise}} com {{signer_name}}, portador(a) do CPF {{signer_document}}, seguindo as seguintes cláusulas:</w:t>
+        <w:t xml:space="preserve">Este contrato formaliza a prestação de serviços e venda de produtos da empresa </w:t>
+      </w:r>
+      <w:r>
+        <w:rPr>
+          <w:rFonts w:cs="Times New Roman" w:ascii="Times New Roman" w:hAnsi="Times New Roman"/>
+          <w:b/>
+          <w:bCs/>
+          <w:sz w:val="24"/>
+          <w:szCs w:val="24"/>
+        </w:rPr>
+        <w:t>{{enterprise}}</w:t>
+      </w:r>
+      <w:r>
+        <w:rPr>
+          <w:rFonts w:cs="Times New Roman" w:ascii="Times New Roman" w:hAnsi="Times New Roman"/>
+          <w:sz w:val="24"/>
+          <w:szCs w:val="24"/>
+        </w:rPr>
+        <w:t xml:space="preserve"> com </w:t>
+      </w:r>
+      <w:r>
+        <w:rPr>
+          <w:rFonts w:cs="Times New Roman" w:ascii="Times New Roman" w:hAnsi="Times New Roman"/>
+          <w:b/>
+          <w:bCs/>
+          <w:sz w:val="24"/>
+          <w:szCs w:val="24"/>
+        </w:rPr>
+        <w:t>{{signer_name}}</w:t>
+      </w:r>
+      <w:r>
+        <w:rPr>
+          <w:rFonts w:cs="Times New Roman" w:ascii="Times New Roman" w:hAnsi="Times New Roman"/>
+          <w:sz w:val="24"/>
+          <w:szCs w:val="24"/>
+        </w:rPr>
+        <w:t xml:space="preserve">, portador(a) do CPF </w:t>
+      </w:r>
+      <w:r>
+        <w:rPr>
+          <w:rFonts w:cs="Times New Roman" w:ascii="Times New Roman" w:hAnsi="Times New Roman"/>
+          <w:b/>
+          <w:bCs/>
+          <w:sz w:val="24"/>
+          <w:szCs w:val="24"/>
+        </w:rPr>
+        <w:t>{{signer_document}}</w:t>
+      </w:r>
+      <w:r>
+        <w:rPr>
+          <w:rFonts w:cs="Times New Roman" w:ascii="Times New Roman" w:hAnsi="Times New Roman"/>
+          <w:b w:val="false"/>
+          <w:bCs w:val="false"/>
+          <w:sz w:val="24"/>
+          <w:szCs w:val="24"/>
+        </w:rPr>
+        <w:t>,</w:t>
+      </w:r>
+      <w:r>
+        <w:rPr>
+          <w:rFonts w:cs="Times New Roman" w:ascii="Times New Roman" w:hAnsi="Times New Roman"/>
+          <w:sz w:val="24"/>
+          <w:szCs w:val="24"/>
+        </w:rPr>
+        <w:t xml:space="preserve"> seguindo as seguintes cláusulas:</w:t>
       </w:r>
     </w:p>
     <w:p>
@@ -370,7 +434,49 @@
           <w:rFonts w:ascii="Times New Roman" w:hAnsi="Times New Roman"/>
         </w:rPr>
         <w:tab/>
-        <w:t>São Paulo, {{created_day_contract}} de {{created_month_contract}} de {{created_year_contract}}.</w:t>
+        <w:t xml:space="preserve">São Paulo, </w:t>
+      </w:r>
+      <w:r>
+        <w:rPr>
+          <w:rFonts w:ascii="Times New Roman" w:hAnsi="Times New Roman"/>
+          <w:b/>
+          <w:bCs/>
+        </w:rPr>
+        <w:t>{{created_day_contract}}</w:t>
+      </w:r>
+      <w:r>
+        <w:rPr>
+          <w:rFonts w:ascii="Times New Roman" w:hAnsi="Times New Roman"/>
+        </w:rPr>
+        <w:t xml:space="preserve"> de </w:t>
+      </w:r>
+      <w:r>
+        <w:rPr>
+          <w:rFonts w:ascii="Times New Roman" w:hAnsi="Times New Roman"/>
+          <w:b/>
+          <w:bCs/>
+        </w:rPr>
+        <w:t>{{created_month_contract}}</w:t>
+      </w:r>
+      <w:r>
+        <w:rPr>
+          <w:rFonts w:ascii="Times New Roman" w:hAnsi="Times New Roman"/>
+        </w:rPr>
+        <w:t xml:space="preserve"> de </w:t>
+      </w:r>
+      <w:r>
+        <w:rPr>
+          <w:rFonts w:ascii="Times New Roman" w:hAnsi="Times New Roman"/>
+          <w:b/>
+          <w:bCs/>
+        </w:rPr>
+        <w:t>{{created_year_contract}}</w:t>
+      </w:r>
+      <w:r>
+        <w:rPr>
+          <w:rFonts w:ascii="Times New Roman" w:hAnsi="Times New Roman"/>
+        </w:rPr>
+        <w:t>.</w:t>
       </w:r>
     </w:p>
     <w:p>
@@ -455,12 +561,15 @@
         <w:contextualSpacing/>
         <w:jc w:val="center"/>
         <w:rPr>
-          <w:rFonts w:ascii="Times New Roman" w:hAnsi="Times New Roman"/>
-        </w:rPr>
-      </w:pPr>
-      <w:r>
-        <w:rPr>
-          <w:rFonts w:ascii="Times New Roman" w:hAnsi="Times New Roman"/>
+          <w:b/>
+          <w:bCs/>
+        </w:rPr>
+      </w:pPr>
+      <w:r>
+        <w:rPr>
+          <w:rFonts w:ascii="Times New Roman" w:hAnsi="Times New Roman"/>
+          <w:b/>
+          <w:bCs/>
         </w:rPr>
         <w:t>{{~position_sign_signer}}</w:t>
       </w:r>

</xml_diff>